<commit_message>
docs(obs-01): atualiza doc técnica e project-status após OBS-01
- technical-documentation.md v2.1: seção Observabilidade (Sentry v10/PostHog/useAnalytics/vars de ambiente), stack + estrutura de pastas atualizados
- project-status.md v2.1: stack (Sentry + PostHog), tabela progresso (Segurança 100%, Observabilidade 100%, IA 80%, Gamificação 40%)
- Artefatos DOCX e PDF regenerados

Co-Authored-By: Claude Sonnet 4.6 <noreply@anthropic.com>
</commit_message>
<xml_diff>
--- a/docs/project-status/project-status.docx
+++ b/docs/project-status/project-status.docx
@@ -82,7 +82,7 @@
           <w:sz w:val="20"/>
           <w:szCs w:val="20"/>
         </w:rPr>
-        <w:t xml:space="preserve">Versão 2.0  ·  6 de junho de 2026</w:t>
+        <w:t xml:space="preserve">Versão 2.0  ·  8 de junho de 2026</w:t>
       </w:r>
     </w:p>
     <w:p>
@@ -137,7 +137,7 @@
           <w:sz w:val="22"/>
           <w:szCs w:val="22"/>
         </w:rPr>
-        <w:t xml:space="preserve"> 2.0  </w:t>
+        <w:t xml:space="preserve"> 2.1  </w:t>
       </w:r>
     </w:p>
     <w:p>
@@ -162,7 +162,7 @@
           <w:sz w:val="22"/>
           <w:szCs w:val="22"/>
         </w:rPr>
-        <w:t xml:space="preserve"> 2026-06-06  </w:t>
+        <w:t xml:space="preserve"> 2026-06-08  </w:t>
       </w:r>
     </w:p>
     <w:p>
@@ -187,7 +187,7 @@
           <w:sz w:val="22"/>
           <w:szCs w:val="22"/>
         </w:rPr>
-        <w:t xml:space="preserve"> MVP em desenvolvimento ativo — Fases 1–4 + UX-01 + QA-01 concluídas</w:t>
+        <w:t xml:space="preserve"> MVP em desenvolvimento ativo — Fases 1–4 + UX-01 + QA-01 + Sprints 1–4 + OBS-01 concluídas</w:t>
       </w:r>
     </w:p>
     <w:p>
@@ -935,7 +935,7 @@
                 <w:sz w:val="20"/>
                 <w:szCs w:val="20"/>
               </w:rPr>
-              <w:t xml:space="preserve">95%</w:t>
+              <w:t xml:space="preserve">100%</w:t>
             </w:r>
           </w:p>
         </w:tc>
@@ -1067,107 +1067,163 @@
                 <w:sz w:val="20"/>
                 <w:szCs w:val="20"/>
               </w:rPr>
-              <w:t xml:space="preserve">IA (Geração de Flashcards)</w:t>
-            </w:r>
-          </w:p>
-        </w:tc>
-        <w:tc>
-          <w:tcPr>
-            <w:shd/>
-          </w:tcPr>
-          <w:p>
-            <w:r>
-              <w:rPr>
-                <w:rFonts w:ascii="Calibri" w:cs="Calibri" w:eastAsia="Calibri" w:hAnsi="Calibri"/>
-                <w:b w:val="false"/>
-                <w:bCs w:val="false"/>
-                <w:color w:val="1E293B"/>
-                <w:sz w:val="20"/>
-                <w:szCs w:val="20"/>
-              </w:rPr>
-              <w:t xml:space="preserve">🔜 Pendente</w:t>
-            </w:r>
-          </w:p>
-        </w:tc>
-        <w:tc>
-          <w:tcPr>
-            <w:shd/>
-          </w:tcPr>
-          <w:p>
-            <w:r>
-              <w:rPr>
-                <w:rFonts w:ascii="Calibri" w:cs="Calibri" w:eastAsia="Calibri" w:hAnsi="Calibri"/>
-                <w:b w:val="false"/>
-                <w:bCs w:val="false"/>
-                <w:color w:val="1E293B"/>
-                <w:sz w:val="20"/>
-                <w:szCs w:val="20"/>
-              </w:rPr>
-              <w:t xml:space="preserve">20%</w:t>
-            </w:r>
-          </w:p>
-        </w:tc>
-      </w:tr>
-      <w:tr>
-        <w:tc>
-          <w:tcPr>
-            <w:shd w:fill="F1F5F9" w:color="F1F5F9" w:val="solid"/>
-          </w:tcPr>
-          <w:p>
-            <w:r>
-              <w:rPr>
-                <w:rFonts w:ascii="Calibri" w:cs="Calibri" w:eastAsia="Calibri" w:hAnsi="Calibri"/>
-                <w:b w:val="false"/>
-                <w:bCs w:val="false"/>
-                <w:color w:val="1E293B"/>
-                <w:sz w:val="20"/>
-                <w:szCs w:val="20"/>
-              </w:rPr>
-              <w:t xml:space="preserve">Gamificação Avançada</w:t>
-            </w:r>
-          </w:p>
-        </w:tc>
-        <w:tc>
-          <w:tcPr>
-            <w:shd w:fill="F1F5F9" w:color="F1F5F9" w:val="solid"/>
-          </w:tcPr>
-          <w:p>
-            <w:r>
-              <w:rPr>
-                <w:rFonts w:ascii="Calibri" w:cs="Calibri" w:eastAsia="Calibri" w:hAnsi="Calibri"/>
-                <w:b w:val="false"/>
-                <w:bCs w:val="false"/>
-                <w:color w:val="1E293B"/>
-                <w:sz w:val="20"/>
-                <w:szCs w:val="20"/>
-              </w:rPr>
-              <w:t xml:space="preserve">🔜 Pendente</w:t>
-            </w:r>
-          </w:p>
-        </w:tc>
-        <w:tc>
-          <w:tcPr>
-            <w:shd w:fill="F1F5F9" w:color="F1F5F9" w:val="solid"/>
-          </w:tcPr>
-          <w:p>
-            <w:r>
-              <w:rPr>
-                <w:rFonts w:ascii="Calibri" w:cs="Calibri" w:eastAsia="Calibri" w:hAnsi="Calibri"/>
-                <w:b w:val="false"/>
-                <w:bCs w:val="false"/>
-                <w:color w:val="1E293B"/>
-                <w:sz w:val="20"/>
-                <w:szCs w:val="20"/>
-              </w:rPr>
-              <w:t xml:space="preserve">10%</w:t>
-            </w:r>
-          </w:p>
-        </w:tc>
-      </w:tr>
-      <w:tr>
-        <w:tc>
-          <w:tcPr>
-            <w:shd/>
+              <w:t xml:space="preserve">Observabilidade (Sentry + PostHog)</w:t>
+            </w:r>
+          </w:p>
+        </w:tc>
+        <w:tc>
+          <w:tcPr>
+            <w:shd/>
+          </w:tcPr>
+          <w:p>
+            <w:r>
+              <w:rPr>
+                <w:rFonts w:ascii="Calibri" w:cs="Calibri" w:eastAsia="Calibri" w:hAnsi="Calibri"/>
+                <w:b w:val="false"/>
+                <w:bCs w:val="false"/>
+                <w:color w:val="1E293B"/>
+                <w:sz w:val="20"/>
+                <w:szCs w:val="20"/>
+              </w:rPr>
+              <w:t xml:space="preserve">✅ Concluído</w:t>
+            </w:r>
+          </w:p>
+        </w:tc>
+        <w:tc>
+          <w:tcPr>
+            <w:shd/>
+          </w:tcPr>
+          <w:p>
+            <w:r>
+              <w:rPr>
+                <w:rFonts w:ascii="Calibri" w:cs="Calibri" w:eastAsia="Calibri" w:hAnsi="Calibri"/>
+                <w:b w:val="false"/>
+                <w:bCs w:val="false"/>
+                <w:color w:val="1E293B"/>
+                <w:sz w:val="20"/>
+                <w:szCs w:val="20"/>
+              </w:rPr>
+              <w:t xml:space="preserve">100%</w:t>
+            </w:r>
+          </w:p>
+        </w:tc>
+      </w:tr>
+      <w:tr>
+        <w:tc>
+          <w:tcPr>
+            <w:shd w:fill="F1F5F9" w:color="F1F5F9" w:val="solid"/>
+          </w:tcPr>
+          <w:p>
+            <w:r>
+              <w:rPr>
+                <w:rFonts w:ascii="Calibri" w:cs="Calibri" w:eastAsia="Calibri" w:hAnsi="Calibri"/>
+                <w:b w:val="false"/>
+                <w:bCs w:val="false"/>
+                <w:color w:val="1E293B"/>
+                <w:sz w:val="20"/>
+                <w:szCs w:val="20"/>
+              </w:rPr>
+              <w:t xml:space="preserve">IA (Geração de Flashcards + Coach)</w:t>
+            </w:r>
+          </w:p>
+        </w:tc>
+        <w:tc>
+          <w:tcPr>
+            <w:shd w:fill="F1F5F9" w:color="F1F5F9" w:val="solid"/>
+          </w:tcPr>
+          <w:p>
+            <w:r>
+              <w:rPr>
+                <w:rFonts w:ascii="Calibri" w:cs="Calibri" w:eastAsia="Calibri" w:hAnsi="Calibri"/>
+                <w:b w:val="false"/>
+                <w:bCs w:val="false"/>
+                <w:color w:val="1E293B"/>
+                <w:sz w:val="20"/>
+                <w:szCs w:val="20"/>
+              </w:rPr>
+              <w:t xml:space="preserve">✅ Concluído</w:t>
+            </w:r>
+          </w:p>
+        </w:tc>
+        <w:tc>
+          <w:tcPr>
+            <w:shd w:fill="F1F5F9" w:color="F1F5F9" w:val="solid"/>
+          </w:tcPr>
+          <w:p>
+            <w:r>
+              <w:rPr>
+                <w:rFonts w:ascii="Calibri" w:cs="Calibri" w:eastAsia="Calibri" w:hAnsi="Calibri"/>
+                <w:b w:val="false"/>
+                <w:bCs w:val="false"/>
+                <w:color w:val="1E293B"/>
+                <w:sz w:val="20"/>
+                <w:szCs w:val="20"/>
+              </w:rPr>
+              <w:t xml:space="preserve">80%</w:t>
+            </w:r>
+          </w:p>
+        </w:tc>
+      </w:tr>
+      <w:tr>
+        <w:tc>
+          <w:tcPr>
+            <w:shd/>
+          </w:tcPr>
+          <w:p>
+            <w:r>
+              <w:rPr>
+                <w:rFonts w:ascii="Calibri" w:cs="Calibri" w:eastAsia="Calibri" w:hAnsi="Calibri"/>
+                <w:b w:val="false"/>
+                <w:bCs w:val="false"/>
+                <w:color w:val="1E293B"/>
+                <w:sz w:val="20"/>
+                <w:szCs w:val="20"/>
+              </w:rPr>
+              <w:t xml:space="preserve">Gamificação (Conquistas)</w:t>
+            </w:r>
+          </w:p>
+        </w:tc>
+        <w:tc>
+          <w:tcPr>
+            <w:shd/>
+          </w:tcPr>
+          <w:p>
+            <w:r>
+              <w:rPr>
+                <w:rFonts w:ascii="Calibri" w:cs="Calibri" w:eastAsia="Calibri" w:hAnsi="Calibri"/>
+                <w:b w:val="false"/>
+                <w:bCs w:val="false"/>
+                <w:color w:val="1E293B"/>
+                <w:sz w:val="20"/>
+                <w:szCs w:val="20"/>
+              </w:rPr>
+              <w:t xml:space="preserve">✅ Concluído</w:t>
+            </w:r>
+          </w:p>
+        </w:tc>
+        <w:tc>
+          <w:tcPr>
+            <w:shd/>
+          </w:tcPr>
+          <w:p>
+            <w:r>
+              <w:rPr>
+                <w:rFonts w:ascii="Calibri" w:cs="Calibri" w:eastAsia="Calibri" w:hAnsi="Calibri"/>
+                <w:b w:val="false"/>
+                <w:bCs w:val="false"/>
+                <w:color w:val="1E293B"/>
+                <w:sz w:val="20"/>
+                <w:szCs w:val="20"/>
+              </w:rPr>
+              <w:t xml:space="preserve">40%</w:t>
+            </w:r>
+          </w:p>
+        </w:tc>
+      </w:tr>
+      <w:tr>
+        <w:tc>
+          <w:tcPr>
+            <w:shd w:fill="F1F5F9" w:color="F1F5F9" w:val="solid"/>
           </w:tcPr>
           <w:p>
             <w:r>
@@ -1185,37 +1241,37 @@
         </w:tc>
         <w:tc>
           <w:tcPr>
-            <w:shd/>
-          </w:tcPr>
-          <w:p>
-            <w:r>
-              <w:rPr>
-                <w:rFonts w:ascii="Calibri" w:cs="Calibri" w:eastAsia="Calibri" w:hAnsi="Calibri"/>
-                <w:b w:val="false"/>
-                <w:bCs w:val="false"/>
-                <w:color w:val="1E293B"/>
-                <w:sz w:val="20"/>
-                <w:szCs w:val="20"/>
-              </w:rPr>
-              <w:t xml:space="preserve">🔜 Pendente</w:t>
-            </w:r>
-          </w:p>
-        </w:tc>
-        <w:tc>
-          <w:tcPr>
-            <w:shd/>
-          </w:tcPr>
-          <w:p>
-            <w:r>
-              <w:rPr>
-                <w:rFonts w:ascii="Calibri" w:cs="Calibri" w:eastAsia="Calibri" w:hAnsi="Calibri"/>
-                <w:b w:val="false"/>
-                <w:bCs w:val="false"/>
-                <w:color w:val="1E293B"/>
-                <w:sz w:val="20"/>
-                <w:szCs w:val="20"/>
-              </w:rPr>
-              <w:t xml:space="preserve">30%</w:t>
+            <w:shd w:fill="F1F5F9" w:color="F1F5F9" w:val="solid"/>
+          </w:tcPr>
+          <w:p>
+            <w:r>
+              <w:rPr>
+                <w:rFonts w:ascii="Calibri" w:cs="Calibri" w:eastAsia="Calibri" w:hAnsi="Calibri"/>
+                <w:b w:val="false"/>
+                <w:bCs w:val="false"/>
+                <w:color w:val="1E293B"/>
+                <w:sz w:val="20"/>
+                <w:szCs w:val="20"/>
+              </w:rPr>
+              <w:t xml:space="preserve">🔄 Parcial</w:t>
+            </w:r>
+          </w:p>
+        </w:tc>
+        <w:tc>
+          <w:tcPr>
+            <w:shd w:fill="F1F5F9" w:color="F1F5F9" w:val="solid"/>
+          </w:tcPr>
+          <w:p>
+            <w:r>
+              <w:rPr>
+                <w:rFonts w:ascii="Calibri" w:cs="Calibri" w:eastAsia="Calibri" w:hAnsi="Calibri"/>
+                <w:b w:val="false"/>
+                <w:bCs w:val="false"/>
+                <w:color w:val="1E293B"/>
+                <w:sz w:val="20"/>
+                <w:szCs w:val="20"/>
+              </w:rPr>
+              <w:t xml:space="preserve">60%</w:t>
             </w:r>
           </w:p>
         </w:tc>
@@ -1897,6 +1953,118 @@
                 <w:szCs w:val="20"/>
               </w:rPr>
               <w:t xml:space="preserve">1.60.0</w:t>
+            </w:r>
+          </w:p>
+        </w:tc>
+      </w:tr>
+      <w:tr>
+        <w:tc>
+          <w:tcPr>
+            <w:shd/>
+          </w:tcPr>
+          <w:p>
+            <w:r>
+              <w:rPr>
+                <w:rFonts w:ascii="Calibri" w:cs="Calibri" w:eastAsia="Calibri" w:hAnsi="Calibri"/>
+                <w:b w:val="false"/>
+                <w:bCs w:val="false"/>
+                <w:color w:val="1E293B"/>
+                <w:sz w:val="20"/>
+                <w:szCs w:val="20"/>
+              </w:rPr>
+              <w:t xml:space="preserve">Error Tracking</w:t>
+            </w:r>
+          </w:p>
+        </w:tc>
+        <w:tc>
+          <w:tcPr>
+            <w:shd/>
+          </w:tcPr>
+          <w:p>
+            <w:r>
+              <w:rPr>
+                <w:rFonts w:ascii="Calibri" w:cs="Calibri" w:eastAsia="Calibri" w:hAnsi="Calibri"/>
+                <w:b w:val="false"/>
+                <w:bCs w:val="false"/>
+                <w:color w:val="1E293B"/>
+                <w:sz w:val="20"/>
+                <w:szCs w:val="20"/>
+              </w:rPr>
+              <w:t xml:space="preserve">Sentry</w:t>
+            </w:r>
+          </w:p>
+        </w:tc>
+        <w:tc>
+          <w:tcPr>
+            <w:shd/>
+          </w:tcPr>
+          <w:p>
+            <w:r>
+              <w:rPr>
+                <w:rFonts w:ascii="Calibri" w:cs="Calibri" w:eastAsia="Calibri" w:hAnsi="Calibri"/>
+                <w:b w:val="false"/>
+                <w:bCs w:val="false"/>
+                <w:color w:val="1E293B"/>
+                <w:sz w:val="20"/>
+                <w:szCs w:val="20"/>
+              </w:rPr>
+              <w:t xml:space="preserve">10.x</w:t>
+            </w:r>
+          </w:p>
+        </w:tc>
+      </w:tr>
+      <w:tr>
+        <w:tc>
+          <w:tcPr>
+            <w:shd w:fill="F1F5F9" w:color="F1F5F9" w:val="solid"/>
+          </w:tcPr>
+          <w:p>
+            <w:r>
+              <w:rPr>
+                <w:rFonts w:ascii="Calibri" w:cs="Calibri" w:eastAsia="Calibri" w:hAnsi="Calibri"/>
+                <w:b w:val="false"/>
+                <w:bCs w:val="false"/>
+                <w:color w:val="1E293B"/>
+                <w:sz w:val="20"/>
+                <w:szCs w:val="20"/>
+              </w:rPr>
+              <w:t xml:space="preserve">Product Analytics</w:t>
+            </w:r>
+          </w:p>
+        </w:tc>
+        <w:tc>
+          <w:tcPr>
+            <w:shd w:fill="F1F5F9" w:color="F1F5F9" w:val="solid"/>
+          </w:tcPr>
+          <w:p>
+            <w:r>
+              <w:rPr>
+                <w:rFonts w:ascii="Calibri" w:cs="Calibri" w:eastAsia="Calibri" w:hAnsi="Calibri"/>
+                <w:b w:val="false"/>
+                <w:bCs w:val="false"/>
+                <w:color w:val="1E293B"/>
+                <w:sz w:val="20"/>
+                <w:szCs w:val="20"/>
+              </w:rPr>
+              <w:t xml:space="preserve">PostHog</w:t>
+            </w:r>
+          </w:p>
+        </w:tc>
+        <w:tc>
+          <w:tcPr>
+            <w:shd w:fill="F1F5F9" w:color="F1F5F9" w:val="solid"/>
+          </w:tcPr>
+          <w:p>
+            <w:r>
+              <w:rPr>
+                <w:rFonts w:ascii="Calibri" w:cs="Calibri" w:eastAsia="Calibri" w:hAnsi="Calibri"/>
+                <w:b w:val="false"/>
+                <w:bCs w:val="false"/>
+                <w:color w:val="1E293B"/>
+                <w:sz w:val="20"/>
+                <w:szCs w:val="20"/>
+              </w:rPr>
+              <w:t xml:space="preserve">latest</w:t>
             </w:r>
           </w:p>
         </w:tc>

</xml_diff>

<commit_message>
chore: testes US-AI-02, data-testid quiz, remocao MigrationBanner e docs
Adiciona 15 testes unitarios para generateQuizSchema (validation.test.ts)
Adiciona 9 testes E2E para Quiz Adaptativo (TC-QZ-001 a TC-QZ-009)
Adiciona data-testid nos elementos do quiz UI (quiz-loading, quiz-error,
quiz-playing, quiz-question, quiz-option, quiz-next, quiz-done, quiz-score)
Remove MigrationBanner e useMigration (localStorage legado migrado)
Documenta fluxo do Quiz Adaptativo e Modo Professor na doc tecnica
Adiciona secao Aprendizado Ativo no user-guide com os 3 modos
Atualiza project-status: PWA e IA em 100%
Regenera DOCX e PDF de toda a documentacao

Gate: type-check OK lint OK 327/327 testes OK build OK
Production Security Gate: APROVADO

Co-Authored-By: Claude Sonnet 4.6 <noreply@anthropic.com>
</commit_message>
<xml_diff>
--- a/docs/project-status/project-status.docx
+++ b/docs/project-status/project-status.docx
@@ -1123,7 +1123,7 @@
                 <w:sz w:val="20"/>
                 <w:szCs w:val="20"/>
               </w:rPr>
-              <w:t xml:space="preserve">IA (Geração de Flashcards + Coach)</w:t>
+              <w:t xml:space="preserve">IA (Geração de Flashcards + Coach + Quiz + Análise)</w:t>
             </w:r>
           </w:p>
         </w:tc>
@@ -1159,7 +1159,7 @@
                 <w:sz w:val="20"/>
                 <w:szCs w:val="20"/>
               </w:rPr>
-              <w:t xml:space="preserve">80%</w:t>
+              <w:t xml:space="preserve">100%</w:t>
             </w:r>
           </w:p>
         </w:tc>
@@ -1253,25 +1253,137 @@
                 <w:sz w:val="20"/>
                 <w:szCs w:val="20"/>
               </w:rPr>
-              <w:t xml:space="preserve">🔄 Parcial</w:t>
-            </w:r>
-          </w:p>
-        </w:tc>
-        <w:tc>
-          <w:tcPr>
-            <w:shd w:fill="F1F5F9" w:color="F1F5F9" w:val="solid"/>
-          </w:tcPr>
-          <w:p>
-            <w:r>
-              <w:rPr>
-                <w:rFonts w:ascii="Calibri" w:cs="Calibri" w:eastAsia="Calibri" w:hAnsi="Calibri"/>
-                <w:b w:val="false"/>
-                <w:bCs w:val="false"/>
-                <w:color w:val="1E293B"/>
-                <w:sz w:val="20"/>
-                <w:szCs w:val="20"/>
-              </w:rPr>
-              <w:t xml:space="preserve">60%</w:t>
+              <w:t xml:space="preserve">✅ Concluído</w:t>
+            </w:r>
+          </w:p>
+        </w:tc>
+        <w:tc>
+          <w:tcPr>
+            <w:shd w:fill="F1F5F9" w:color="F1F5F9" w:val="solid"/>
+          </w:tcPr>
+          <w:p>
+            <w:r>
+              <w:rPr>
+                <w:rFonts w:ascii="Calibri" w:cs="Calibri" w:eastAsia="Calibri" w:hAnsi="Calibri"/>
+                <w:b w:val="false"/>
+                <w:bCs w:val="false"/>
+                <w:color w:val="1E293B"/>
+                <w:sz w:val="20"/>
+                <w:szCs w:val="20"/>
+              </w:rPr>
+              <w:t xml:space="preserve">100%</w:t>
+            </w:r>
+          </w:p>
+        </w:tc>
+      </w:tr>
+      <w:tr>
+        <w:tc>
+          <w:tcPr>
+            <w:shd/>
+          </w:tcPr>
+          <w:p>
+            <w:r>
+              <w:rPr>
+                <w:rFonts w:ascii="Calibri" w:cs="Calibri" w:eastAsia="Calibri" w:hAnsi="Calibri"/>
+                <w:b w:val="false"/>
+                <w:bCs w:val="false"/>
+                <w:color w:val="1E293B"/>
+                <w:sz w:val="20"/>
+                <w:szCs w:val="20"/>
+              </w:rPr>
+              <w:t xml:space="preserve">Configurações + Export/Import JSON</w:t>
+            </w:r>
+          </w:p>
+        </w:tc>
+        <w:tc>
+          <w:tcPr>
+            <w:shd/>
+          </w:tcPr>
+          <w:p>
+            <w:r>
+              <w:rPr>
+                <w:rFonts w:ascii="Calibri" w:cs="Calibri" w:eastAsia="Calibri" w:hAnsi="Calibri"/>
+                <w:b w:val="false"/>
+                <w:bCs w:val="false"/>
+                <w:color w:val="1E293B"/>
+                <w:sz w:val="20"/>
+                <w:szCs w:val="20"/>
+              </w:rPr>
+              <w:t xml:space="preserve">✅ Concluído</w:t>
+            </w:r>
+          </w:p>
+        </w:tc>
+        <w:tc>
+          <w:tcPr>
+            <w:shd/>
+          </w:tcPr>
+          <w:p>
+            <w:r>
+              <w:rPr>
+                <w:rFonts w:ascii="Calibri" w:cs="Calibri" w:eastAsia="Calibri" w:hAnsi="Calibri"/>
+                <w:b w:val="false"/>
+                <w:bCs w:val="false"/>
+                <w:color w:val="1E293B"/>
+                <w:sz w:val="20"/>
+                <w:szCs w:val="20"/>
+              </w:rPr>
+              <w:t xml:space="preserve">100%</w:t>
+            </w:r>
+          </w:p>
+        </w:tc>
+      </w:tr>
+      <w:tr>
+        <w:tc>
+          <w:tcPr>
+            <w:shd w:fill="F1F5F9" w:color="F1F5F9" w:val="solid"/>
+          </w:tcPr>
+          <w:p>
+            <w:r>
+              <w:rPr>
+                <w:rFonts w:ascii="Calibri" w:cs="Calibri" w:eastAsia="Calibri" w:hAnsi="Calibri"/>
+                <w:b w:val="false"/>
+                <w:bCs w:val="false"/>
+                <w:color w:val="1E293B"/>
+                <w:sz w:val="20"/>
+                <w:szCs w:val="20"/>
+              </w:rPr>
+              <w:t xml:space="preserve">PWA (Instalável + Push Notifications)</w:t>
+            </w:r>
+          </w:p>
+        </w:tc>
+        <w:tc>
+          <w:tcPr>
+            <w:shd w:fill="F1F5F9" w:color="F1F5F9" w:val="solid"/>
+          </w:tcPr>
+          <w:p>
+            <w:r>
+              <w:rPr>
+                <w:rFonts w:ascii="Calibri" w:cs="Calibri" w:eastAsia="Calibri" w:hAnsi="Calibri"/>
+                <w:b w:val="false"/>
+                <w:bCs w:val="false"/>
+                <w:color w:val="1E293B"/>
+                <w:sz w:val="20"/>
+                <w:szCs w:val="20"/>
+              </w:rPr>
+              <w:t xml:space="preserve">✅ Concluído</w:t>
+            </w:r>
+          </w:p>
+        </w:tc>
+        <w:tc>
+          <w:tcPr>
+            <w:shd w:fill="F1F5F9" w:color="F1F5F9" w:val="solid"/>
+          </w:tcPr>
+          <w:p>
+            <w:r>
+              <w:rPr>
+                <w:rFonts w:ascii="Calibri" w:cs="Calibri" w:eastAsia="Calibri" w:hAnsi="Calibri"/>
+                <w:b w:val="false"/>
+                <w:bCs w:val="false"/>
+                <w:color w:val="1E293B"/>
+                <w:sz w:val="20"/>
+                <w:szCs w:val="20"/>
+              </w:rPr>
+              <w:t xml:space="preserve">100%</w:t>
             </w:r>
           </w:p>
         </w:tc>
@@ -9646,37 +9758,6 @@
           <w:sz w:val="22"/>
           <w:szCs w:val="22"/>
         </w:rPr>
-        <w:t xml:space="preserve">`MigrationBanner`:</w:t>
-      </w:r>
-      <w:r>
-        <w:rPr>
-          <w:rFonts w:ascii="Calibri" w:cs="Calibri" w:eastAsia="Calibri" w:hAnsi="Calibri"/>
-          <w:color w:val="1E293B"/>
-          <w:sz w:val="22"/>
-          <w:szCs w:val="22"/>
-        </w:rPr>
-        <w:t xml:space="preserve"> componente ainda presente no layout — remover quando todos os usuários tiverem migrado do localStorage.</w:t>
-      </w:r>
-    </w:p>
-    <w:p>
-      <w:pPr>
-        <w:pStyle w:val="ListParagraph"/>
-        <w:numPr>
-          <w:ilvl w:val="0"/>
-          <w:numId w:val="1"/>
-        </w:numPr>
-        <w:spacing w:after="60" w:before="60"/>
-        <w:ind w:left="431"/>
-      </w:pPr>
-      <w:r>
-        <w:rPr>
-          <w:rFonts w:ascii="Calibri" w:cs="Calibri" w:eastAsia="Calibri" w:hAnsi="Calibri"/>
-          <w:b/>
-          <w:bCs/>
-          <w:color w:val="1E293B"/>
-          <w:sz w:val="22"/>
-          <w:szCs w:val="22"/>
-        </w:rPr>
         <w:t xml:space="preserve">Google OAuth:</w:t>
       </w:r>
       <w:r>
@@ -9686,7 +9767,7 @@
           <w:sz w:val="22"/>
           <w:szCs w:val="22"/>
         </w:rPr>
-        <w:t xml:space="preserve"> configurado no código mas precisa de Client ID/Secret no dashboard Supabase.</w:t>
+        <w:t xml:space="preserve"> configurado no código mas precisa de Client ID/Secret no dashboard Supabase para ativar.</w:t>
       </w:r>
     </w:p>
     <w:p>

</xml_diff>